<commit_message>
Apply second-round review fixes to the revised document
Correct the description of the Urbach 2014 checklist study, drop an
unsourced claim about where learning-styles beliefs persist, align
evidence tags with the document's own protocol, add test plans for two
load-bearing frameworks, rewrite remaining contrast-construction
variants, and update the change log to report the second review.

Co-Authored-By: Claude Opus 5.5 <noreply@anthropic.com>
Claude-Session: https://claude.ai/code/session_01YH3T2RNgykx6jm3WXnBAXL
</commit_message>
<xml_diff>
--- a/deliverables/修订说明.docx
+++ b/deliverables/修订说明.docx
@@ -64,7 +64,7 @@
     </w:p>
     <w:p>
       <w:r>
-        <w:t xml:space="preserve">篇幅：原稿正文约 4.97 万个汉字，另有约 2,200 字的参考文献登记。修订版正文约 4.60 万个汉字，其中新增的第十四章约 5,300 字；不计第十四章，原有部分压缩了约 18%。附录扩充到约 6,800 字，新增了操作版、检验方案与维护说明，参考文献登记增加了核验状态一列。</w:t>
+        <w:t xml:space="preserve">篇幅：原稿正文约 4.97 万个汉字，另有约 2,200 字的参考文献登记。修订版正文约 4.62 万个汉字，其中新增的第十四章约 5,300 字；不计第十四章，原有部分压缩了约 18%。附录扩充到约 7,000 字，新增了操作版、检验方案与维护说明，参考文献登记增加了核验状态一列。</w:t>
       </w:r>
     </w:p>
     <w:p>
@@ -670,7 +670,7 @@
                 <w:sz w:val="18"/>
                 <w:szCs w:val="18"/>
               </w:rPr>
-              <w:t xml:space="preserve">新增附录一“操作版”、附录二“作者框架的检验方案”（十二个框架）</w:t>
+              <w:t xml:space="preserve">新增附录一“操作版”、附录二“作者框架的检验方案”（十四个框架）</w:t>
             </w:r>
           </w:p>
         </w:tc>
@@ -904,6 +904,38 @@
       </w:r>
     </w:p>
     <w:p>
+      <w:r>
+        <w:t xml:space="preserve">第二轮审读之后又调整了几处：课堂测验中以其他精加工为对照的估计，只是单一元分析里的一个分组，标 E3；莫罗等 2001 年的颜色与气味描述研究是单项研究，有方法批评，未见重复，改标 E1；第十章的“主动系统巩固”改标</w:t>
+      </w:r>
+      <w:r>
+        <w:rPr>
+          <w:color w:val="4F6478"/>
+        </w:rPr>
+        <w:t xml:space="preserve">〔机制提案〕</w:t>
+      </w:r>
+      <w:r>
+        <w:t xml:space="preserve">，“非稳态负荷”改标</w:t>
+      </w:r>
+      <w:r>
+        <w:rPr>
+          <w:color w:val="4F6478"/>
+        </w:rPr>
+        <w:t xml:space="preserve">〔概念框架〕</w:t>
+      </w:r>
+      <w:r>
+        <w:t xml:space="preserve">，耶基斯-多德森一段的 E 级改挂在具体的经验主张上；因果之梯补标</w:t>
+      </w:r>
+      <w:r>
+        <w:rPr>
+          <w:color w:val="4F6478"/>
+        </w:rPr>
+        <w:t xml:space="preserve">〔概念框架〕</w:t>
+      </w:r>
+      <w:r>
+        <w:t xml:space="preserve">。</w:t>
+      </w:r>
+    </w:p>
+    <w:p>
       <w:pPr>
         <w:pStyle w:val="Heading2"/>
       </w:pPr>
@@ -957,6 +989,11 @@
       </w:r>
     </w:p>
     <w:p>
+      <w:r>
+        <w:t xml:space="preserve">第二轮审读又发现几处事实问题，均已更正。Haynes 2009 与 Urbach 2014 两项核查表研究，初稿写成了设计类型不同；两者都是非随机的前后比较，差别在规模、实施方式与基线。学习风格一段删去了“帕什勒之后主要在商业培训中流行”这个没有来源的判断。表现与学习的区分早于 2015 年，改为“索德斯特罗姆与比约克 2015 年的综述系统梳理了这个区分”。《论语》没有记载孔子说这句话的地点，删去“在鲁国”。McLean 与 Pontiff 的 26% 限定为样本期结束后、论文发表之前的下降。</w:t>
+      </w:r>
+    </w:p>
+    <w:p>
       <w:pPr>
         <w:pStyle w:val="Heading2"/>
       </w:pPr>
@@ -976,12 +1013,12 @@
     </w:p>
     <w:p>
       <w:r>
-        <w:t xml:space="preserve">原稿的核心句“学习是模型的治理术”无法检验。修订版改为“学习是对内部模型的选择、检验与修订”，写出一处可以检验的推论，并如实说明现有证据只支持其中关于保持与校准的部分。附录二为十二个承重框架写出了对照方案、测量与迫使修订的结果，另有三个框架明确说明暂时只是组织材料的方式。</w:t>
-      </w:r>
-    </w:p>
-    <w:p>
-      <w:r>
-        <w:t xml:space="preserve">按修订要求的用语规则，删除了规则禁止的全部对比句式，包括省去连词、换用近义词的同构写法，一律改为两个独立的陈述句；终稿用正则扫描复查过。装饰性的比喻（房租、燃料、健身房、探照灯、地基开裂、牢笼、交出体检报告、供电等）改为直白陈述，“买入持有”与“租用”保留一次，明确标为便于记忆的说法。“的”字密度，初稿比原稿明显升高，终稿为每千个汉字约 44 个，仍高于原稿的约 40 个，主要因为修订版多用了解释性的定语从句。</w:t>
+        <w:t xml:space="preserve">原稿的核心句“学习是模型的治理术”无法检验。修订版改为“学习是对内部模型的选择、检验与修订”，写出一处可以检验的推论，并如实说明现有证据只支持其中关于保持与校准的部分。附录二为十四个承重框架写出了对照方案、测量与迫使修订的结果；另有两个框架明确说明暂时只是组织材料的方式，一条经验推测说明暂时缺少可行的对照设计。</w:t>
+      </w:r>
+    </w:p>
+    <w:p>
+      <w:r>
+        <w:t xml:space="preserve">按修订要求的用语规则，删除了规则禁止的对比句式，包括省去连词、换用近义词的同构写法，一律改为两个独立的陈述句。第二轮审读又找出十余处前肯定、后否定的变体，已经改写；终稿再用正则扫描与人工通读复查。装饰性的比喻（房租、燃料、健身房、探照灯、地基开裂、牢笼、交出体检报告、供电等）改为直白陈述，“买入持有”与“租用”保留一次，明确标为便于记忆的说法。“的”字密度，初稿比原稿明显升高，终稿为每千个汉字约 44 个，仍高于原稿的约 40 个，主要因为修订版多用了解释性的定语从句。</w:t>
       </w:r>
     </w:p>
     <w:p>
@@ -1007,7 +1044,7 @@
     </w:p>
     <w:p>
       <w:r>
-        <w:t xml:space="preserve">本次修订做了两轮独立的文献核查，分别覆盖原稿中存疑的定量主张与新增的来源；受运行环境限制，核查无法打开论文全文页面，全部依据学术检索结果中的摘要原句、正文片段或二手转述，附录三为每条来源标注了核验状态。修订稿随后经过一轮完整的独立审读，指出 36 处实质问题与约 80 处用语问题，均已处理；之后作者对终稿逐章通读，做了最后的修正。第二轮独立审读在交付时没有完成。会话的检索额度用完后，有七项由作者凭记忆引用、未能复核：Grove 等 2000，Camerer 等 2018，McLean 与 Pontiff 2016，Urbach 等 2014，Kalyuga 等 2003，Rasch 与 Born 2013，Moran 2016。沿用原稿核验的条目，本次没有重新核对。</w:t>
+        <w:t xml:space="preserve">本次修订做了两轮独立的文献核查，分别覆盖原稿中存疑的定量主张与新增的来源；受运行环境限制，核查无法打开论文全文页面，全部依据学术检索结果中的摘要原句、正文片段或二手转述，附录三为每条来源标注了核验状态。修订稿随后经过两轮独立审读。第一轮指出 36 处实质问题与约 80 处用语问题，均已处理。第二轮逐条复核了这些处理，确认多数已经解决，并指出新的问题：Urbach 2014 的研究设计写错，若干证据标签与本文协议不符，两个承重框架缺少检验方案，十余处句子仍是对比句式的变体，另有几处为减少“的”字改得别扭。这些问题都已处理，本说明第三至五节已计入。作者还对终稿逐章通读了一遍。会话的检索额度用完后，有七项由作者凭记忆引用、未能复核：Grove 等 2000，Camerer 等 2018，McLean 与 Pontiff 2016，Urbach 等 2014，Kalyuga 等 2003，Rasch 与 Born 2013，Moran 2016。沿用原稿核验的条目，本次没有重新核对。</w:t>
       </w:r>
     </w:p>
     <w:p>

</xml_diff>